<commit_message>
Fix: Resolve KaTeX math parser conflict by using HTML currency entities in Streamlit app; set Word report table borders to pure black
</commit_message>
<xml_diff>
--- a/Healthcare_Provider_Fraud_Detection_Report.docx
+++ b/Healthcare_Provider_Fraud_Detection_Report.docx
@@ -162,12 +162,12 @@
         <w:jc w:val="center"/>
         <w:tblLook w:firstColumn="1" w:firstRow="1" w:lastColumn="0" w:lastRow="0" w:noHBand="0" w:noVBand="1" w:val="04A0"/>
         <w:tblBorders>
-          <w:top w:val="single" w:sz="4" w:space="0" w:color="555555"/>
-          <w:bottom w:val="single" w:sz="4" w:space="0" w:color="555555"/>
-          <w:left w:val="single" w:sz="4" w:space="0" w:color="555555"/>
-          <w:right w:val="single" w:sz="4" w:space="0" w:color="555555"/>
-          <w:insideH w:val="single" w:sz="4" w:space="0" w:color="555555"/>
-          <w:insideV w:val="single" w:sz="4" w:space="0" w:color="555555"/>
+          <w:top w:val="single" w:sz="4" w:space="0" w:color="000000"/>
+          <w:bottom w:val="single" w:sz="4" w:space="0" w:color="000000"/>
+          <w:left w:val="single" w:sz="4" w:space="0" w:color="000000"/>
+          <w:right w:val="single" w:sz="4" w:space="0" w:color="000000"/>
+          <w:insideH w:val="single" w:sz="4" w:space="0" w:color="000000"/>
+          <w:insideV w:val="single" w:sz="4" w:space="0" w:color="000000"/>
         </w:tblBorders>
       </w:tblPr>
       <w:tblGrid>
@@ -366,12 +366,12 @@
         <w:tblLayout w:type="fixed"/>
         <w:tblLook w:firstColumn="1" w:firstRow="1" w:lastColumn="0" w:lastRow="0" w:noHBand="0" w:noVBand="1" w:val="04A0"/>
         <w:tblBorders>
-          <w:top w:val="single" w:sz="4" w:space="0" w:color="555555"/>
-          <w:bottom w:val="single" w:sz="4" w:space="0" w:color="555555"/>
-          <w:left w:val="single" w:sz="4" w:space="0" w:color="555555"/>
-          <w:right w:val="single" w:sz="4" w:space="0" w:color="555555"/>
-          <w:insideH w:val="single" w:sz="4" w:space="0" w:color="555555"/>
-          <w:insideV w:val="single" w:sz="4" w:space="0" w:color="555555"/>
+          <w:top w:val="single" w:sz="4" w:space="0" w:color="000000"/>
+          <w:bottom w:val="single" w:sz="4" w:space="0" w:color="000000"/>
+          <w:left w:val="single" w:sz="4" w:space="0" w:color="000000"/>
+          <w:right w:val="single" w:sz="4" w:space="0" w:color="000000"/>
+          <w:insideH w:val="single" w:sz="4" w:space="0" w:color="000000"/>
+          <w:insideV w:val="single" w:sz="4" w:space="0" w:color="000000"/>
         </w:tblBorders>
       </w:tblPr>
       <w:tblGrid>
@@ -1673,12 +1673,12 @@
         <w:tblLayout w:type="fixed"/>
         <w:tblLook w:firstColumn="1" w:firstRow="1" w:lastColumn="0" w:lastRow="0" w:noHBand="0" w:noVBand="1" w:val="04A0"/>
         <w:tblBorders>
-          <w:top w:val="single" w:sz="4" w:space="0" w:color="555555"/>
-          <w:bottom w:val="single" w:sz="4" w:space="0" w:color="555555"/>
-          <w:left w:val="single" w:sz="4" w:space="0" w:color="555555"/>
-          <w:right w:val="single" w:sz="4" w:space="0" w:color="555555"/>
-          <w:insideH w:val="single" w:sz="4" w:space="0" w:color="555555"/>
-          <w:insideV w:val="single" w:sz="4" w:space="0" w:color="555555"/>
+          <w:top w:val="single" w:sz="4" w:space="0" w:color="000000"/>
+          <w:bottom w:val="single" w:sz="4" w:space="0" w:color="000000"/>
+          <w:left w:val="single" w:sz="4" w:space="0" w:color="000000"/>
+          <w:right w:val="single" w:sz="4" w:space="0" w:color="000000"/>
+          <w:insideH w:val="single" w:sz="4" w:space="0" w:color="000000"/>
+          <w:insideV w:val="single" w:sz="4" w:space="0" w:color="000000"/>
         </w:tblBorders>
       </w:tblPr>
       <w:tblGrid>
@@ -3664,12 +3664,12 @@
         <w:tblLayout w:type="fixed"/>
         <w:tblLook w:firstColumn="1" w:firstRow="1" w:lastColumn="0" w:lastRow="0" w:noHBand="0" w:noVBand="1" w:val="04A0"/>
         <w:tblBorders>
-          <w:top w:val="single" w:sz="4" w:space="0" w:color="555555"/>
-          <w:bottom w:val="single" w:sz="4" w:space="0" w:color="555555"/>
-          <w:left w:val="single" w:sz="4" w:space="0" w:color="555555"/>
-          <w:right w:val="single" w:sz="4" w:space="0" w:color="555555"/>
-          <w:insideH w:val="single" w:sz="4" w:space="0" w:color="555555"/>
-          <w:insideV w:val="single" w:sz="4" w:space="0" w:color="555555"/>
+          <w:top w:val="single" w:sz="4" w:space="0" w:color="000000"/>
+          <w:bottom w:val="single" w:sz="4" w:space="0" w:color="000000"/>
+          <w:left w:val="single" w:sz="4" w:space="0" w:color="000000"/>
+          <w:right w:val="single" w:sz="4" w:space="0" w:color="000000"/>
+          <w:insideH w:val="single" w:sz="4" w:space="0" w:color="000000"/>
+          <w:insideV w:val="single" w:sz="4" w:space="0" w:color="000000"/>
         </w:tblBorders>
       </w:tblPr>
       <w:tblGrid>
@@ -5369,12 +5369,12 @@
         <w:tblLayout w:type="fixed"/>
         <w:tblLook w:firstColumn="1" w:firstRow="1" w:lastColumn="0" w:lastRow="0" w:noHBand="0" w:noVBand="1" w:val="04A0"/>
         <w:tblBorders>
-          <w:top w:val="single" w:sz="4" w:space="0" w:color="555555"/>
-          <w:bottom w:val="single" w:sz="4" w:space="0" w:color="555555"/>
-          <w:left w:val="single" w:sz="4" w:space="0" w:color="555555"/>
-          <w:right w:val="single" w:sz="4" w:space="0" w:color="555555"/>
-          <w:insideH w:val="single" w:sz="4" w:space="0" w:color="555555"/>
-          <w:insideV w:val="single" w:sz="4" w:space="0" w:color="555555"/>
+          <w:top w:val="single" w:sz="4" w:space="0" w:color="000000"/>
+          <w:bottom w:val="single" w:sz="4" w:space="0" w:color="000000"/>
+          <w:left w:val="single" w:sz="4" w:space="0" w:color="000000"/>
+          <w:right w:val="single" w:sz="4" w:space="0" w:color="000000"/>
+          <w:insideH w:val="single" w:sz="4" w:space="0" w:color="000000"/>
+          <w:insideV w:val="single" w:sz="4" w:space="0" w:color="000000"/>
         </w:tblBorders>
       </w:tblPr>
       <w:tblGrid>

</xml_diff>

<commit_message>
Update: Refine Word report content to remove first-person phrasing, adjust Optuna claims to match codebase reality, and track holdout_predictions.csv for Streamlit slider
</commit_message>
<xml_diff>
--- a/Healthcare_Provider_Fraud_Detection_Report.docx
+++ b/Healthcare_Provider_Fraud_Detection_Report.docx
@@ -86,7 +86,7 @@
         <w:rPr>
           <w:color w:val="111111"/>
         </w:rPr>
-        <w:t>Healthcare fraud, waste, and abuse (FWA) represent a significant financial challenge that escalates insurance premiums and drains public healthcare funds. Traditional detection methods rely on deterministic, rule-based systems that fail to detect coordinated schemes, billing rings, and patient-upcoding behaviors. This report presents a machine learning pipeline developed to identify potentially fraudulent healthcare providers. By merging and aggregating beneficiary profiles, outpatient billings, and inpatient medical stays, I constructed 57 provider-level behavioral features.</w:t>
+        <w:t>Healthcare fraud, waste, and abuse (FWA) represent a significant financial challenge that escalates insurance premiums and drains public healthcare funds. Traditional detection methods rely on deterministic, rule-based systems that fail to detect coordinated schemes, billing rings, and patient-upcoding behaviors. This report presents a machine learning pipeline developed to identify potentially fraudulent healthcare providers. By merging and aggregating beneficiary profiles, outpatient billings, and inpatient medical stays, 57 provider-level behavioral features were constructed.</w:t>
       </w:r>
     </w:p>
     <w:p>
@@ -98,7 +98,7 @@
         <w:rPr>
           <w:color w:val="111111"/>
         </w:rPr>
-        <w:t>Through statistical screening and feature selection, I isolated the top 35 signature features. My model architecture features a Stacking Ensemble Classifier comprising XGBoost, LightGBM DART, and CatBoost as base estimators, blended using a Logistic Regression meta-classifier. To handle target class imbalance (9.7:1 ratio), I leveraged native model class weights during training rather than synthetic oversampling, preserving natural decision boundaries.</w:t>
+        <w:t>Through statistical screening and feature selection, the top 35 signature features were isolated. The model architecture features a Stacking Ensemble Classifier comprising XGBoost, LightGBM DART, and CatBoost as base estimators, blended using a Logistic Regression meta-classifier. To handle target class imbalance (9.7:1 ratio), native model class weights were leveraged during training rather than synthetic oversampling, preserving natural decision boundaries.</w:t>
       </w:r>
     </w:p>
     <w:p>
@@ -110,7 +110,7 @@
         <w:rPr>
           <w:color w:val="111111"/>
         </w:rPr>
-        <w:t>Validation was executed using 5-fold stratified cross-validation alongside an independent 10% holdout set. At the threshold of 0.85 (optimized for F1), the Stacking Ensemble achieved a holdout ROC-AUC of 0.9579, an F1-Score of 0.6441, a Recall of 74.51%, and a Precision of 56.72%. At the F2-optimal threshold of 0.47, the model successfully recovered 90.20% of all fraud cases in the unseen set (Recall) at 39.32% Precision, providing insurance investigators with a fraud screening system.</w:t>
+        <w:t>Validation was executed using 5-fold stratified cross-validation alongside an independent 10% holdout set. At the threshold of 0.85 (optimized for F1), the Stacking Ensemble achieved a holdout ROC-AUC of 0.9579, an F1-Score of 0.6441, a Recall of 74.51%, and a Precision of 56.72%. At the F2-optimal threshold of 0.47, the model successfully recovered 90.20% of all fraud cases in the holdout set (Recall) at 39.32% Precision, providing an operational fraud screening baseline.</w:t>
       </w:r>
     </w:p>
     <w:p>
@@ -122,7 +122,7 @@
         <w:rPr>
           <w:color w:val="111111"/>
         </w:rPr>
-        <w:t>Integrated directly into a Streamlit analytics application, this model provides real-time provider risk scoring, interactive peer comparison, SHAP feature attribution, and an investigator capacity planning framework. My ROI analysis shows that prioritizing cases using the model's risk scores yields an optimal investigation point at 62 provider audits, generating a peak net savings of over $1.88M per inspection cohort and saving administrative hours.</w:t>
+        <w:t>Integrated directly into a Streamlit analytics application, this model provides real-time provider risk scoring, interactive peer comparison, SHAP feature attribution, and an investigator capacity planning framework. An ROI analysis indicates that prioritizing cases using the model's risk scores yields an optimal investigation point at 62 provider audits, generating a peak projected net savings of over $1.88M per inspection cohort and saving administrative hours.</w:t>
       </w:r>
     </w:p>
     <w:p>
@@ -325,7 +325,7 @@
         <w:rPr>
           <w:color w:val="111111"/>
         </w:rPr>
-        <w:t>Discussion: The ROC-AUC of 0.9579 indicates exceptional discriminative power, ensuring that a randomly selected fraudulent provider will receive a higher risk score than a legitimate provider 95.8% of the time. The F1-score of 0.644 matches a recall of 74.5% with a precision of 56.7%. In practice, this means that more than half of the providers flagged by the model will be confirmed as fraudulent upon manual review, minimizing the administrative cost of false positives.</w:t>
+        <w:t>Discussion: The ROC-AUC of 0.9579 indicates strong discriminative power, ensuring that a randomly selected fraudulent provider will receive a higher risk score than a legitimate provider 95.8% of the time. The F1-score of 0.644 matches a recall of 74.5% with a precision of 56.7%. In practice, this means that more than half of the providers flagged by the model will be confirmed as fraudulent upon manual review, minimizing the administrative cost of false positives.</w:t>
       </w:r>
     </w:p>
     <w:p>
@@ -356,7 +356,7 @@
         <w:rPr>
           <w:color w:val="111111"/>
         </w:rPr>
-        <w:t>A comparison of historical provider data reveals massive, systemic behavioral differences between fraudulent and legitimate healthcare providers. These indicators highlight that fraud is driven primarily by financial inflation, excessive inpatient stay durations, and patient upcoding. The table below details these key findings:</w:t>
+        <w:t>A comparison of historical provider data reveals significant behavioral differences between fraudulent and legitimate healthcare providers. These indicators suggest that potential fraud is characterized primarily by financial inflation, longer inpatient stay durations, and patient upcoding. The table below details these key findings:</w:t>
       </w:r>
     </w:p>
     <w:tbl>
@@ -828,7 +828,7 @@
         <w:rPr>
           <w:color w:val="111111"/>
         </w:rPr>
-        <w:t>To counteract these billing networks, it is necessary to aggregate individual beneficiary claims up to the provider level, enabling the identification of systematic behavioral anomalies. Common fraud patterns targeted by my machine learning features include:</w:t>
+        <w:t>To counteract these billing networks, it is necessary to aggregate individual beneficiary claims up to the provider level, enabling the identification of systematic behavioral anomalies. Common fraud patterns targeted by the engineered features include:</w:t>
       </w:r>
     </w:p>
     <w:p>
@@ -1285,7 +1285,7 @@
         <w:rPr>
           <w:color w:val="111111"/>
         </w:rPr>
-        <w:t>The historical target data has a significant class imbalance (9.7:1 legitimate-to-fraud ratio). Instead of using synthetic oversampling (SMOTE), which can create unrealistic combinations of aggregated features, I utilized native model class weights during XGBoost, LightGBM, and CatBoost training. This maintains the physical bounds of the engineered metrics.</w:t>
+        <w:t>The historical target data has a significant class imbalance (9.7:1 legitimate-to-fraud ratio). Instead of using synthetic oversampling (SMOTE), which can create unrealistic combinations of aggregated features, native model class weights were utilized during XGBoost, LightGBM, and CatBoost training. This maintains the physical bounds of the engineered metrics.</w:t>
       </w:r>
     </w:p>
     <w:p>
@@ -1316,7 +1316,7 @@
         <w:rPr>
           <w:color w:val="111111"/>
         </w:rPr>
-        <w:t>My exploratory data analysis reveals strong, systematic differences in billing volumes, medical stay durations, and reimbursement distributions between legitimate and fraudulent providers. These differences confirm that fraudulent providers systematically inflate claims to maximize payouts.</w:t>
+        <w:t>Exploratory data analysis reveals strong, systematic differences in billing volumes, medical stay durations, and reimbursement distributions between legitimate and fraudulent providers. These differences indicate that fraudulent providers systematically inflate claims to maximize payouts.</w:t>
       </w:r>
     </w:p>
     <w:p>
@@ -1423,7 +1423,7 @@
         <w:rPr>
           <w:color w:val="111111"/>
         </w:rPr>
-        <w:t>To capture these complex billing patterns, I engineered 57 provider-level features across financial, volume, clinical, behavioral, and temporal categories. These features map raw claims events into predictive provider-level metrics. The primary feature categories include:</w:t>
+        <w:t>To capture these complex billing patterns, 57 provider-level features were engineered across financial, volume, clinical, behavioral, and temporal categories. These features map raw claims events into predictive provider-level metrics. The primary feature categories include:</w:t>
       </w:r>
     </w:p>
     <w:p>
@@ -1518,7 +1518,7 @@
         <w:rPr>
           <w:color w:val="111111"/>
         </w:rPr>
-        <w:t>Identifies physician rings and patient recycling. We calculate PhysicianConcentration (using the Herfindahl-Hirschman Index) and RepeatPatientRatio. High physician concentration shows that a provider bills the majority of their claims under a single physician ID, indicating coordinate billing rings.</w:t>
+        <w:t>Identifies physician rings and patient recycling. PhysicianConcentration (using the Herfindahl-Hirschman Index) and RepeatPatientRatio were calculated. High physician concentration shows that a provider bills the majority of their claims under a single physician ID, indicating coordinate billing rings.</w:t>
       </w:r>
     </w:p>
     <w:p>
@@ -1568,7 +1568,7 @@
         <w:rPr>
           <w:color w:val="111111"/>
         </w:rPr>
-        <w:t>To build a robust fraud detection system, I evaluated several machine learning models: Logistic Regression, Random Forest (300 estimators), XGBoost (Optuna-tuned), LightGBM, and CatBoost. The final architecture utilizes a Stacking Ensemble Classifier to combine the strengths of the base models.</w:t>
+        <w:t>To build a robust fraud detection system, several machine learning models were evaluated: Logistic Regression, Random Forest (300 estimators), XGBoost (Optuna-tuned), LightGBM, and CatBoost. The final architecture utilizes a Stacking Ensemble Classifier to combine the strengths of the base models.</w:t>
       </w:r>
     </w:p>
     <w:p>
@@ -1620,7 +1620,7 @@
         <w:rPr>
           <w:color w:val="111111"/>
         </w:rPr>
-        <w:t>To protect against target leakage, I implemented a 5-fold Stratified Cross-Validation protocol. Hyperparameters for XGBoost, LightGBM, and CatBoost were optimized using Optuna over 100 trials, maximizing the cross-validated F1-score.</w:t>
+        <w:t>To protect against target leakage, a 5-fold Stratified Cross-Validation protocol was implemented. Hyperparameters for the XGBoost base model were optimized using Optuna over 15 trials, while LightGBM and CatBoost utilized default baseline settings.</w:t>
       </w:r>
     </w:p>
     <w:p>
@@ -1632,7 +1632,7 @@
         <w:rPr>
           <w:color w:val="111111"/>
         </w:rPr>
-        <w:t>To handle class imbalance, I configured native class weights (`scale_pos_weight` in XGBoost/LightGBM and `auto_class_weights` in CatBoost) proportional to the 9.7:1 target class ratio, avoiding the noise introduced by SMOTE.</w:t>
+        <w:t>To handle class imbalance, native class weights (`scale_pos_weight` in XGBoost/LightGBM and `auto_class_weights` in CatBoost) were configured proportional to the 9.7:1 target class ratio, avoiding the noise introduced by SMOTE.</w:t>
       </w:r>
     </w:p>
     <w:p>
@@ -3509,7 +3509,7 @@
         <w:rPr>
           <w:color w:val="111111"/>
         </w:rPr>
-        <w:t>To explain model predictions, I calculated SHAP (SHapley Additive exPlanations) values to capture global feature importances. This analysis reveals the key drivers of provider fraud risk:</w:t>
+        <w:t>To explain model predictions, SHAP (SHapley Additive exPlanations) values were calculated to capture global feature importances. This analysis reveals the key drivers of provider fraud risk:</w:t>
       </w:r>
     </w:p>
     <w:p>
@@ -3654,7 +3654,7 @@
         <w:rPr>
           <w:color w:val="111111"/>
         </w:rPr>
-        <w:t>Traditional auditing reviews cases randomly or chronologically, resulting in low recovery rates. By sorting providers by the model's risk scores, the framework constructs an optimal audit frontier. My ROI analysis assumes standard operational parameters: an average audit cost of $2,500 per provider, a median recovery value of $220,000 per fraud case, and a 70% audit recovery success rate.</w:t>
+        <w:t>Traditional auditing reviews cases randomly or chronologically, resulting in low recovery rates. By sorting providers by the model's risk scores, the framework constructs an optimal audit frontier. The ROI analysis is based on an illustrative business scenario with example operational assumptions: an average audit cost of $2,500 per provider, an estimated median recovery value of $220,000 per potential fraud case, and a projected 70% audit recovery success rate.</w:t>
       </w:r>
     </w:p>
     <w:tbl>
@@ -4493,7 +4493,7 @@
         <w:rPr>
           <w:color w:val="111111"/>
         </w:rPr>
-        <w:t>As shown in the table, auditing the top 62 highest-risk providers yields a peak ROI of $6,251,400 in net savings. Beyond this frontier, the model's risk scores decrease, and the cost of auditing ($2,500/provider) begins to outweigh the expected recovery value of low-risk cases. This optimal audit capacity enables insurance providers to maximize fraud recovery efficiency.</w:t>
+        <w:t>As shown in the table, under this illustrative scenario, auditing the top 62 highest-risk providers projects a peak estimated net savings of $6,251,400. Beyond this frontier, the model's risk scores decrease, and the cost of auditing ($2,500/provider) begins to outweigh the expected recovery value of low-risk cases. This estimated optimal audit capacity provides a target baseline to optimize audit recovery efficiency.</w:t>
       </w:r>
     </w:p>
     <w:p>
@@ -4524,7 +4524,7 @@
         <w:rPr>
           <w:color w:val="111111"/>
         </w:rPr>
-        <w:t>To integrate the stacking classifier into daily operations at a health insurance firm, I propose a five-stage deployment roadmap:</w:t>
+        <w:t>To integrate the stacking classifier into daily operations at a health insurance firm, a five-stage deployment roadmap is proposed:</w:t>
       </w:r>
     </w:p>
     <w:p>
@@ -4581,7 +4581,7 @@
         <w:rPr>
           <w:color w:val="111111"/>
         </w:rPr>
-        <w:t>I define action thresholds based on risk tiers: High Risk (&gt;=0.85) triggers immediate payment holds and comprehensive audit requests; Medium Risk (0.50-0.84) triggers pre-payment medical record reviews; Low Risk (&lt;0.50) is logged for standard monitoring.</w:t>
+        <w:t>Action thresholds are defined based on risk tiers: High Risk (&gt;=0.85) triggers immediate payment holds and comprehensive audit requests; Medium Risk (0.50-0.84) triggers pre-payment medical record reviews; Low Risk (&lt;0.50) is logged for standard monitoring.</w:t>
       </w:r>
     </w:p>
     <w:p>
@@ -4650,7 +4650,7 @@
         <w:rPr>
           <w:color w:val="111111"/>
         </w:rPr>
-        <w:t>I deployed the machine learning pipeline into a professional, enterprise-grade Streamlit application. The application contains 6 primary pages to support clinical and financial fraud audits:</w:t>
+        <w:t>The machine learning pipeline was integrated into an interactive Streamlit application. The application contains 6 primary pages to support clinical and financial fraud audits:</w:t>
       </w:r>
     </w:p>
     <w:p>
@@ -5171,7 +5171,7 @@
         <w:rPr>
           <w:color w:val="111111"/>
         </w:rPr>
-        <w:t>This case study demonstrates the effectiveness of combining provider-level feature engineering with a machine learning Stacking Ensemble to identify healthcare billing fraud. By aggregating claims data to the provider level, the model successfully identifies anomalous billing patterns that are invisible at the individual claims level.</w:t>
+        <w:t>This case study demonstrates the feasibility of combining provider-level feature engineering with a machine learning Stacking Ensemble to identify healthcare billing fraud. By aggregating claims data to the provider level, the ensemble framework identifies anomalous billing patterns that are invisible at the individual claims level.</w:t>
       </w:r>
     </w:p>
     <w:p>
@@ -5183,7 +5183,7 @@
         <w:rPr>
           <w:color w:val="111111"/>
         </w:rPr>
-        <w:t>The Stacking Ensemble (XGBoost, LightGBM, CatBoost, and a Logistic Regression meta-classifier) achieved a holdout ROC-AUC of 0.9579, an F1-Score of 0.6441, a Recall of 74.51%, and a Precision of 56.72% at the F1-optimal threshold. At the F2-optimal threshold of 0.47, the model recovered 90.20% of all fraud cases in the holdout set, providing a robust screening mechanism.</w:t>
+        <w:t>The Stacking Ensemble (XGBoost, LightGBM, CatBoost, and a Logistic Regression meta-classifier) achieved a holdout ROC-AUC of 0.9579, an F1-Score of 0.6441, a Recall of 74.51%, and a Precision of 56.72% at the F1-optimal threshold. At the F2-optimal threshold of 0.47, the model recovered 90.20% of all fraud cases in the holdout set, providing an operational screening baseline.</w:t>
       </w:r>
     </w:p>
     <w:p>
@@ -5195,7 +5195,7 @@
         <w:rPr>
           <w:color w:val="111111"/>
         </w:rPr>
-        <w:t>For deployment and integration, I recommend the following next steps:</w:t>
+        <w:t>For operational deployment and integration, the following next steps are recommended:</w:t>
       </w:r>
     </w:p>
     <w:p>
@@ -5318,31 +5318,17 @@
         </w:rPr>
         <w:t xml:space="preserve"> Healthcare_Fraud_Detection/</w:t>
         <w:br/>
-        <w:t xml:space="preserve"> ├── Data/</w:t>
+        <w:t xml:space="preserve"> ├── streamlit_app.py                  # Streamlit dashboard application</w:t>
         <w:br/>
-        <w:t xml:space="preserve"> │   ├── Training Data/                 # Historical claims and beneficiary details</w:t>
+        <w:t xml:space="preserve"> ├── run_pipeline.py                   # Model training and pipeline script</w:t>
         <w:br/>
-        <w:t xml:space="preserve"> │   └── Unseen Data/                   # Unseen test set claims data</w:t>
-        <w:br/>
-        <w:t xml:space="preserve"> ├── streamlit_app.py                  # Streamlit dashboard script</w:t>
-        <w:br/>
-        <w:t xml:space="preserve"> ├── generate_report.py                # Report generator script (python-docx)</w:t>
-        <w:br/>
-        <w:t xml:space="preserve"> ├── generate_html.py                  # HTML conversion utility</w:t>
-        <w:br/>
-        <w:t xml:space="preserve"> ├── run_pipeline.py                   # Data aggregation &amp; modeling pipeline</w:t>
-        <w:br/>
-        <w:t xml:space="preserve"> ├── Healthcare_Fraud_Detection.ipynb  # Interactive notebook</w:t>
+        <w:t xml:space="preserve"> ├── Healthcare_Fraud_Detection.ipynb  # Main analysis Jupyter Notebook</w:t>
         <w:br/>
         <w:t xml:space="preserve"> ├── best_model.pkl                    # Serialized Stacking Ensemble model</w:t>
         <w:br/>
         <w:t xml:space="preserve"> ├── top_features.pkl                  # Serialized list of top 35 features</w:t>
         <w:br/>
-        <w:t xml:space="preserve"> ├── model_results.csv                 # Metrics CSV for all models evaluated</w:t>
-        <w:br/>
-        <w:t xml:space="preserve"> ├── pipeline_summary.json             # Execution summary metadata</w:t>
-        <w:br/>
-        <w:t xml:space="preserve"> ├── Submission.csv                    # Final predictions output file</w:t>
+        <w:t xml:space="preserve"> ├── Tharun Kumar V_Submission.csv     # Final predictions output file</w:t>
         <w:br/>
         <w:t xml:space="preserve"> └── Healthcare_Provider_Fraud_Detection_Report.docx  # Final Case Study Report</w:t>
         <w:br/>

</xml_diff>